<commit_message>
Enlarge the guest names on the table cards
18pt to 26pt, with the leading opened from 2pt to 6pt, so the block fills the
card instead of floating in the middle of it. Content now occupies 78% of the
page height rather than roughly half.

26pt is the ceiling: the binding constraint is width, not height, and the
longest name on any card ("Hannah Lovatt-Thompson" on Magnolia) still sets on
one line. Verified no name wraps on any of the nine cards, and the QR code
still decodes on all nine.

Co-Authored-By: Claude Opus 5 (1M context) <noreply@anthropic.com>
</commit_message>
<xml_diff>
--- a/print/table-cards.docx
+++ b/print/table-cards.docx
@@ -62,7 +62,7 @@
           </w:tcPr>
           <w:p>
             <w:pPr>
-              <w:spacing w:before="40" w:after="40"/>
+              <w:spacing w:before="120" w:after="120"/>
               <w:jc w:val="center"/>
             </w:pPr>
             <w:r>
@@ -71,7 +71,7 @@
                 <w:b w:val="0"/>
                 <w:i w:val="0"/>
                 <w:color w:val="222D2A"/>
-                <w:sz w:val="36"/>
+                <w:sz w:val="52"/>
               </w:rPr>
               <w:t>Justin Harte</w:t>
             </w:r>
@@ -83,7 +83,7 @@
           </w:tcPr>
           <w:p>
             <w:pPr>
-              <w:spacing w:before="40" w:after="40"/>
+              <w:spacing w:before="120" w:after="120"/>
               <w:jc w:val="center"/>
             </w:pPr>
             <w:r>
@@ -92,7 +92,7 @@
                 <w:b w:val="0"/>
                 <w:i w:val="0"/>
                 <w:color w:val="222D2A"/>
-                <w:sz w:val="36"/>
+                <w:sz w:val="52"/>
               </w:rPr>
               <w:t>Elliott Hyndman</w:t>
             </w:r>
@@ -106,7 +106,7 @@
           </w:tcPr>
           <w:p>
             <w:pPr>
-              <w:spacing w:before="40" w:after="40"/>
+              <w:spacing w:before="120" w:after="120"/>
               <w:jc w:val="center"/>
             </w:pPr>
             <w:r>
@@ -115,7 +115,7 @@
                 <w:b w:val="0"/>
                 <w:i w:val="0"/>
                 <w:color w:val="222D2A"/>
-                <w:sz w:val="36"/>
+                <w:sz w:val="52"/>
               </w:rPr>
               <w:t>Nolene Harte</w:t>
             </w:r>
@@ -127,7 +127,7 @@
           </w:tcPr>
           <w:p>
             <w:pPr>
-              <w:spacing w:before="40" w:after="40"/>
+              <w:spacing w:before="120" w:after="120"/>
               <w:jc w:val="center"/>
             </w:pPr>
             <w:r>
@@ -136,7 +136,7 @@
                 <w:b w:val="0"/>
                 <w:i w:val="0"/>
                 <w:color w:val="222D2A"/>
-                <w:sz w:val="36"/>
+                <w:sz w:val="52"/>
               </w:rPr>
               <w:t>Britt Hyndman</w:t>
             </w:r>
@@ -150,7 +150,7 @@
           </w:tcPr>
           <w:p>
             <w:pPr>
-              <w:spacing w:before="40" w:after="40"/>
+              <w:spacing w:before="120" w:after="120"/>
               <w:jc w:val="center"/>
             </w:pPr>
             <w:r>
@@ -159,7 +159,7 @@
                 <w:b w:val="0"/>
                 <w:i w:val="0"/>
                 <w:color w:val="222D2A"/>
-                <w:sz w:val="36"/>
+                <w:sz w:val="52"/>
               </w:rPr>
               <w:t>Darren Harte</w:t>
             </w:r>
@@ -171,7 +171,7 @@
           </w:tcPr>
           <w:p>
             <w:pPr>
-              <w:spacing w:before="40" w:after="40"/>
+              <w:spacing w:before="120" w:after="120"/>
               <w:jc w:val="center"/>
             </w:pPr>
             <w:r>
@@ -180,7 +180,7 @@
                 <w:b w:val="0"/>
                 <w:i w:val="0"/>
                 <w:color w:val="222D2A"/>
-                <w:sz w:val="36"/>
+                <w:sz w:val="52"/>
               </w:rPr>
               <w:t>River</w:t>
             </w:r>
@@ -194,7 +194,7 @@
           </w:tcPr>
           <w:p>
             <w:pPr>
-              <w:spacing w:before="40" w:after="40"/>
+              <w:spacing w:before="120" w:after="120"/>
               <w:jc w:val="center"/>
             </w:pPr>
             <w:r>
@@ -203,7 +203,7 @@
                 <w:b w:val="0"/>
                 <w:i w:val="0"/>
                 <w:color w:val="222D2A"/>
-                <w:sz w:val="36"/>
+                <w:sz w:val="52"/>
               </w:rPr>
               <w:t>Mark Harte</w:t>
             </w:r>
@@ -215,7 +215,7 @@
           </w:tcPr>
           <w:p>
             <w:pPr>
-              <w:spacing w:before="40" w:after="40"/>
+              <w:spacing w:before="120" w:after="120"/>
               <w:jc w:val="center"/>
             </w:pPr>
             <w:r>
@@ -224,7 +224,7 @@
                 <w:b w:val="0"/>
                 <w:i w:val="0"/>
                 <w:color w:val="222D2A"/>
-                <w:sz w:val="36"/>
+                <w:sz w:val="52"/>
               </w:rPr>
               <w:t>Oakley</w:t>
             </w:r>
@@ -351,7 +351,7 @@
           </w:tcPr>
           <w:p>
             <w:pPr>
-              <w:spacing w:before="40" w:after="40"/>
+              <w:spacing w:before="120" w:after="120"/>
               <w:jc w:val="center"/>
             </w:pPr>
             <w:r>
@@ -360,7 +360,7 @@
                 <w:b w:val="0"/>
                 <w:i w:val="0"/>
                 <w:color w:val="222D2A"/>
-                <w:sz w:val="36"/>
+                <w:sz w:val="52"/>
               </w:rPr>
               <w:t>George Slater</w:t>
             </w:r>
@@ -372,7 +372,7 @@
           </w:tcPr>
           <w:p>
             <w:pPr>
-              <w:spacing w:before="40" w:after="40"/>
+              <w:spacing w:before="120" w:after="120"/>
               <w:jc w:val="center"/>
             </w:pPr>
             <w:r>
@@ -381,7 +381,7 @@
                 <w:b w:val="0"/>
                 <w:i w:val="0"/>
                 <w:color w:val="222D2A"/>
-                <w:sz w:val="36"/>
+                <w:sz w:val="52"/>
               </w:rPr>
               <w:t>Craig Hargreaves</w:t>
             </w:r>
@@ -395,7 +395,7 @@
           </w:tcPr>
           <w:p>
             <w:pPr>
-              <w:spacing w:before="40" w:after="40"/>
+              <w:spacing w:before="120" w:after="120"/>
               <w:jc w:val="center"/>
             </w:pPr>
             <w:r>
@@ -404,7 +404,7 @@
                 <w:b w:val="0"/>
                 <w:i w:val="0"/>
                 <w:color w:val="222D2A"/>
-                <w:sz w:val="36"/>
+                <w:sz w:val="52"/>
               </w:rPr>
               <w:t>Kayleigh Thomas</w:t>
             </w:r>
@@ -416,7 +416,7 @@
           </w:tcPr>
           <w:p>
             <w:pPr>
-              <w:spacing w:before="40" w:after="40"/>
+              <w:spacing w:before="120" w:after="120"/>
               <w:jc w:val="center"/>
             </w:pPr>
             <w:r>
@@ -425,7 +425,7 @@
                 <w:b w:val="0"/>
                 <w:i w:val="0"/>
                 <w:color w:val="222D2A"/>
-                <w:sz w:val="36"/>
+                <w:sz w:val="52"/>
               </w:rPr>
               <w:t>Dawn Porter Hargreaves</w:t>
             </w:r>
@@ -439,7 +439,7 @@
           </w:tcPr>
           <w:p>
             <w:pPr>
-              <w:spacing w:before="40" w:after="40"/>
+              <w:spacing w:before="120" w:after="120"/>
               <w:jc w:val="center"/>
             </w:pPr>
             <w:r>
@@ -448,7 +448,7 @@
                 <w:b w:val="0"/>
                 <w:i w:val="0"/>
                 <w:color w:val="222D2A"/>
-                <w:sz w:val="36"/>
+                <w:sz w:val="52"/>
               </w:rPr>
               <w:t>Mandy Slater</w:t>
             </w:r>
@@ -460,7 +460,7 @@
           </w:tcPr>
           <w:p>
             <w:pPr>
-              <w:spacing w:before="40" w:after="40"/>
+              <w:spacing w:before="120" w:after="120"/>
               <w:jc w:val="center"/>
             </w:pPr>
             <w:r>
@@ -469,7 +469,7 @@
                 <w:b w:val="0"/>
                 <w:i w:val="0"/>
                 <w:color w:val="222D2A"/>
-                <w:sz w:val="36"/>
+                <w:sz w:val="52"/>
               </w:rPr>
               <w:t>Florence</w:t>
             </w:r>
@@ -483,7 +483,7 @@
           </w:tcPr>
           <w:p>
             <w:pPr>
-              <w:spacing w:before="40" w:after="40"/>
+              <w:spacing w:before="120" w:after="120"/>
               <w:jc w:val="center"/>
             </w:pPr>
             <w:r>
@@ -492,7 +492,7 @@
                 <w:b w:val="0"/>
                 <w:i w:val="0"/>
                 <w:color w:val="222D2A"/>
-                <w:sz w:val="36"/>
+                <w:sz w:val="52"/>
               </w:rPr>
               <w:t>Steve Slater</w:t>
             </w:r>
@@ -504,7 +504,7 @@
           </w:tcPr>
           <w:p>
             <w:pPr>
-              <w:spacing w:before="40" w:after="40"/>
+              <w:spacing w:before="120" w:after="120"/>
               <w:jc w:val="center"/>
             </w:pPr>
             <w:r>
@@ -513,7 +513,7 @@
                 <w:b w:val="0"/>
                 <w:i w:val="0"/>
                 <w:color w:val="222D2A"/>
-                <w:sz w:val="36"/>
+                <w:sz w:val="52"/>
               </w:rPr>
               <w:t>Thomas Porter</w:t>
             </w:r>
@@ -640,7 +640,7 @@
           </w:tcPr>
           <w:p>
             <w:pPr>
-              <w:spacing w:before="40" w:after="40"/>
+              <w:spacing w:before="120" w:after="120"/>
               <w:jc w:val="center"/>
             </w:pPr>
             <w:r>
@@ -649,7 +649,7 @@
                 <w:b w:val="0"/>
                 <w:i w:val="0"/>
                 <w:color w:val="222D2A"/>
-                <w:sz w:val="36"/>
+                <w:sz w:val="52"/>
               </w:rPr>
               <w:t>Robert Blackshaw</w:t>
             </w:r>
@@ -661,7 +661,7 @@
           </w:tcPr>
           <w:p>
             <w:pPr>
-              <w:spacing w:before="40" w:after="40"/>
+              <w:spacing w:before="120" w:after="120"/>
               <w:jc w:val="center"/>
             </w:pPr>
             <w:r>
@@ -670,7 +670,7 @@
                 <w:b w:val="0"/>
                 <w:i w:val="0"/>
                 <w:color w:val="222D2A"/>
-                <w:sz w:val="36"/>
+                <w:sz w:val="52"/>
               </w:rPr>
               <w:t>Oliver</w:t>
             </w:r>
@@ -684,7 +684,7 @@
           </w:tcPr>
           <w:p>
             <w:pPr>
-              <w:spacing w:before="40" w:after="40"/>
+              <w:spacing w:before="120" w:after="120"/>
               <w:jc w:val="center"/>
             </w:pPr>
             <w:r>
@@ -693,7 +693,7 @@
                 <w:b w:val="0"/>
                 <w:i w:val="0"/>
                 <w:color w:val="222D2A"/>
-                <w:sz w:val="36"/>
+                <w:sz w:val="52"/>
               </w:rPr>
               <w:t>Marie Blackshaw</w:t>
             </w:r>
@@ -705,7 +705,7 @@
           </w:tcPr>
           <w:p>
             <w:pPr>
-              <w:spacing w:before="40" w:after="40"/>
+              <w:spacing w:before="120" w:after="120"/>
               <w:jc w:val="center"/>
             </w:pPr>
             <w:r>
@@ -714,7 +714,7 @@
                 <w:b w:val="0"/>
                 <w:i w:val="0"/>
                 <w:color w:val="222D2A"/>
-                <w:sz w:val="36"/>
+                <w:sz w:val="52"/>
               </w:rPr>
               <w:t>Rhys</w:t>
             </w:r>
@@ -728,7 +728,7 @@
           </w:tcPr>
           <w:p>
             <w:pPr>
-              <w:spacing w:before="40" w:after="40"/>
+              <w:spacing w:before="120" w:after="120"/>
               <w:jc w:val="center"/>
             </w:pPr>
             <w:r>
@@ -737,7 +737,7 @@
                 <w:b w:val="0"/>
                 <w:i w:val="0"/>
                 <w:color w:val="222D2A"/>
-                <w:sz w:val="36"/>
+                <w:sz w:val="52"/>
               </w:rPr>
               <w:t>Guy Blackshaw</w:t>
             </w:r>
@@ -749,7 +749,7 @@
           </w:tcPr>
           <w:p>
             <w:pPr>
-              <w:spacing w:before="40" w:after="40"/>
+              <w:spacing w:before="120" w:after="120"/>
               <w:jc w:val="center"/>
             </w:pPr>
             <w:r>
@@ -758,7 +758,7 @@
                 <w:b w:val="0"/>
                 <w:i w:val="0"/>
                 <w:color w:val="222D2A"/>
-                <w:sz w:val="36"/>
+                <w:sz w:val="52"/>
               </w:rPr>
               <w:t>Henry</w:t>
             </w:r>
@@ -772,7 +772,7 @@
           </w:tcPr>
           <w:p>
             <w:pPr>
-              <w:spacing w:before="40" w:after="40"/>
+              <w:spacing w:before="120" w:after="120"/>
               <w:jc w:val="center"/>
             </w:pPr>
             <w:r>
@@ -781,7 +781,7 @@
                 <w:b w:val="0"/>
                 <w:i w:val="0"/>
                 <w:color w:val="222D2A"/>
-                <w:sz w:val="36"/>
+                <w:sz w:val="52"/>
               </w:rPr>
               <w:t>Lu Blackshaw</w:t>
             </w:r>
@@ -914,7 +914,7 @@
           </w:tcPr>
           <w:p>
             <w:pPr>
-              <w:spacing w:before="40" w:after="40"/>
+              <w:spacing w:before="120" w:after="120"/>
               <w:jc w:val="center"/>
             </w:pPr>
             <w:r>
@@ -923,7 +923,7 @@
                 <w:b w:val="0"/>
                 <w:i w:val="0"/>
                 <w:color w:val="222D2A"/>
-                <w:sz w:val="36"/>
+                <w:sz w:val="52"/>
               </w:rPr>
               <w:t>Ursula Carey</w:t>
             </w:r>
@@ -935,7 +935,7 @@
           </w:tcPr>
           <w:p>
             <w:pPr>
-              <w:spacing w:before="40" w:after="40"/>
+              <w:spacing w:before="120" w:after="120"/>
               <w:jc w:val="center"/>
             </w:pPr>
             <w:r>
@@ -944,7 +944,7 @@
                 <w:b w:val="0"/>
                 <w:i w:val="0"/>
                 <w:color w:val="222D2A"/>
-                <w:sz w:val="36"/>
+                <w:sz w:val="52"/>
               </w:rPr>
               <w:t>Mary Harte</w:t>
             </w:r>
@@ -958,7 +958,7 @@
           </w:tcPr>
           <w:p>
             <w:pPr>
-              <w:spacing w:before="40" w:after="40"/>
+              <w:spacing w:before="120" w:after="120"/>
               <w:jc w:val="center"/>
             </w:pPr>
             <w:r>
@@ -967,7 +967,7 @@
                 <w:b w:val="0"/>
                 <w:i w:val="0"/>
                 <w:color w:val="222D2A"/>
-                <w:sz w:val="36"/>
+                <w:sz w:val="52"/>
               </w:rPr>
               <w:t>Martin Carey</w:t>
             </w:r>
@@ -979,7 +979,7 @@
           </w:tcPr>
           <w:p>
             <w:pPr>
-              <w:spacing w:before="40" w:after="40"/>
+              <w:spacing w:before="120" w:after="120"/>
               <w:jc w:val="center"/>
             </w:pPr>
             <w:r>
@@ -988,7 +988,7 @@
                 <w:b w:val="0"/>
                 <w:i w:val="0"/>
                 <w:color w:val="222D2A"/>
-                <w:sz w:val="36"/>
+                <w:sz w:val="52"/>
               </w:rPr>
               <w:t>Donald Harte</w:t>
             </w:r>
@@ -1002,7 +1002,7 @@
           </w:tcPr>
           <w:p>
             <w:pPr>
-              <w:spacing w:before="40" w:after="40"/>
+              <w:spacing w:before="120" w:after="120"/>
               <w:jc w:val="center"/>
             </w:pPr>
             <w:r>
@@ -1011,7 +1011,7 @@
                 <w:b w:val="0"/>
                 <w:i w:val="0"/>
                 <w:color w:val="222D2A"/>
-                <w:sz w:val="36"/>
+                <w:sz w:val="52"/>
               </w:rPr>
               <w:t>Wayne Harling</w:t>
             </w:r>
@@ -1023,7 +1023,7 @@
           </w:tcPr>
           <w:p>
             <w:pPr>
-              <w:spacing w:before="40" w:after="40"/>
+              <w:spacing w:before="120" w:after="120"/>
               <w:jc w:val="center"/>
             </w:pPr>
             <w:r>
@@ -1032,7 +1032,7 @@
                 <w:b w:val="0"/>
                 <w:i w:val="0"/>
                 <w:color w:val="222D2A"/>
-                <w:sz w:val="36"/>
+                <w:sz w:val="52"/>
               </w:rPr>
               <w:t>Dónal Harte</w:t>
             </w:r>
@@ -1046,7 +1046,7 @@
           </w:tcPr>
           <w:p>
             <w:pPr>
-              <w:spacing w:before="40" w:after="40"/>
+              <w:spacing w:before="120" w:after="120"/>
               <w:jc w:val="center"/>
             </w:pPr>
             <w:r>
@@ -1055,7 +1055,7 @@
                 <w:b w:val="0"/>
                 <w:i w:val="0"/>
                 <w:color w:val="222D2A"/>
-                <w:sz w:val="36"/>
+                <w:sz w:val="52"/>
               </w:rPr>
               <w:t>Lizzie Harling</w:t>
             </w:r>
@@ -1188,7 +1188,7 @@
           </w:tcPr>
           <w:p>
             <w:pPr>
-              <w:spacing w:before="40" w:after="40"/>
+              <w:spacing w:before="120" w:after="120"/>
               <w:jc w:val="center"/>
             </w:pPr>
             <w:r>
@@ -1197,7 +1197,7 @@
                 <w:b w:val="0"/>
                 <w:i w:val="0"/>
                 <w:color w:val="222D2A"/>
-                <w:sz w:val="36"/>
+                <w:sz w:val="52"/>
               </w:rPr>
               <w:t>Rachael Arnold</w:t>
             </w:r>
@@ -1209,7 +1209,7 @@
           </w:tcPr>
           <w:p>
             <w:pPr>
-              <w:spacing w:before="40" w:after="40"/>
+              <w:spacing w:before="120" w:after="120"/>
               <w:jc w:val="center"/>
             </w:pPr>
             <w:r>
@@ -1218,7 +1218,7 @@
                 <w:b w:val="0"/>
                 <w:i w:val="0"/>
                 <w:color w:val="222D2A"/>
-                <w:sz w:val="36"/>
+                <w:sz w:val="52"/>
               </w:rPr>
               <w:t>Helen Lovatt</w:t>
             </w:r>
@@ -1232,7 +1232,7 @@
           </w:tcPr>
           <w:p>
             <w:pPr>
-              <w:spacing w:before="40" w:after="40"/>
+              <w:spacing w:before="120" w:after="120"/>
               <w:jc w:val="center"/>
             </w:pPr>
             <w:r>
@@ -1241,7 +1241,7 @@
                 <w:b w:val="0"/>
                 <w:i w:val="0"/>
                 <w:color w:val="222D2A"/>
-                <w:sz w:val="36"/>
+                <w:sz w:val="52"/>
               </w:rPr>
               <w:t>Chris Arnold</w:t>
             </w:r>
@@ -1253,7 +1253,7 @@
           </w:tcPr>
           <w:p>
             <w:pPr>
-              <w:spacing w:before="40" w:after="40"/>
+              <w:spacing w:before="120" w:after="120"/>
               <w:jc w:val="center"/>
             </w:pPr>
             <w:r>
@@ -1262,7 +1262,7 @@
                 <w:b w:val="0"/>
                 <w:i w:val="0"/>
                 <w:color w:val="222D2A"/>
-                <w:sz w:val="36"/>
+                <w:sz w:val="52"/>
               </w:rPr>
               <w:t>Dave Lovatt</w:t>
             </w:r>
@@ -1276,7 +1276,7 @@
           </w:tcPr>
           <w:p>
             <w:pPr>
-              <w:spacing w:before="40" w:after="40"/>
+              <w:spacing w:before="120" w:after="120"/>
               <w:jc w:val="center"/>
             </w:pPr>
             <w:r>
@@ -1285,7 +1285,7 @@
                 <w:b w:val="0"/>
                 <w:i w:val="0"/>
                 <w:color w:val="222D2A"/>
-                <w:sz w:val="36"/>
+                <w:sz w:val="52"/>
               </w:rPr>
               <w:t>Penelope</w:t>
             </w:r>
@@ -1297,7 +1297,7 @@
           </w:tcPr>
           <w:p>
             <w:pPr>
-              <w:spacing w:before="40" w:after="40"/>
+              <w:spacing w:before="120" w:after="120"/>
               <w:jc w:val="center"/>
             </w:pPr>
             <w:r>
@@ -1306,7 +1306,7 @@
                 <w:b w:val="0"/>
                 <w:i w:val="0"/>
                 <w:color w:val="222D2A"/>
-                <w:sz w:val="36"/>
+                <w:sz w:val="52"/>
               </w:rPr>
               <w:t>Hannah Lovatt-Thompson</w:t>
             </w:r>
@@ -1320,7 +1320,7 @@
           </w:tcPr>
           <w:p>
             <w:pPr>
-              <w:spacing w:before="40" w:after="40"/>
+              <w:spacing w:before="120" w:after="120"/>
               <w:jc w:val="center"/>
             </w:pPr>
             <w:r>
@@ -1329,7 +1329,7 @@
                 <w:b w:val="0"/>
                 <w:i w:val="0"/>
                 <w:color w:val="222D2A"/>
-                <w:sz w:val="36"/>
+                <w:sz w:val="52"/>
               </w:rPr>
               <w:t>Bonnie</w:t>
             </w:r>
@@ -1341,7 +1341,7 @@
           </w:tcPr>
           <w:p>
             <w:pPr>
-              <w:spacing w:before="40" w:after="40"/>
+              <w:spacing w:before="120" w:after="120"/>
               <w:jc w:val="center"/>
             </w:pPr>
             <w:r>
@@ -1350,7 +1350,7 @@
                 <w:b w:val="0"/>
                 <w:i w:val="0"/>
                 <w:color w:val="222D2A"/>
-                <w:sz w:val="36"/>
+                <w:sz w:val="52"/>
               </w:rPr>
               <w:t>Luke Lovatt-Thompson</w:t>
             </w:r>
@@ -1477,7 +1477,7 @@
           </w:tcPr>
           <w:p>
             <w:pPr>
-              <w:spacing w:before="40" w:after="40"/>
+              <w:spacing w:before="120" w:after="120"/>
               <w:jc w:val="center"/>
             </w:pPr>
             <w:r>
@@ -1486,7 +1486,7 @@
                 <w:b w:val="0"/>
                 <w:i w:val="0"/>
                 <w:color w:val="222D2A"/>
-                <w:sz w:val="36"/>
+                <w:sz w:val="52"/>
               </w:rPr>
               <w:t>Vicky Blackshaw</w:t>
             </w:r>
@@ -1498,7 +1498,7 @@
           </w:tcPr>
           <w:p>
             <w:pPr>
-              <w:spacing w:before="40" w:after="40"/>
+              <w:spacing w:before="120" w:after="120"/>
               <w:jc w:val="center"/>
             </w:pPr>
             <w:r>
@@ -1507,7 +1507,7 @@
                 <w:b w:val="0"/>
                 <w:i w:val="0"/>
                 <w:color w:val="222D2A"/>
-                <w:sz w:val="36"/>
+                <w:sz w:val="52"/>
               </w:rPr>
               <w:t>Diane George</w:t>
             </w:r>
@@ -1521,7 +1521,7 @@
           </w:tcPr>
           <w:p>
             <w:pPr>
-              <w:spacing w:before="40" w:after="40"/>
+              <w:spacing w:before="120" w:after="120"/>
               <w:jc w:val="center"/>
             </w:pPr>
             <w:r>
@@ -1530,7 +1530,7 @@
                 <w:b w:val="0"/>
                 <w:i w:val="0"/>
                 <w:color w:val="222D2A"/>
-                <w:sz w:val="36"/>
+                <w:sz w:val="52"/>
               </w:rPr>
               <w:t>Jon Abbotts</w:t>
             </w:r>
@@ -1542,7 +1542,7 @@
           </w:tcPr>
           <w:p>
             <w:pPr>
-              <w:spacing w:before="40" w:after="40"/>
+              <w:spacing w:before="120" w:after="120"/>
               <w:jc w:val="center"/>
             </w:pPr>
             <w:r>
@@ -1551,7 +1551,7 @@
                 <w:b w:val="0"/>
                 <w:i w:val="0"/>
                 <w:color w:val="222D2A"/>
-                <w:sz w:val="36"/>
+                <w:sz w:val="52"/>
               </w:rPr>
               <w:t>Matthew George</w:t>
             </w:r>
@@ -1565,7 +1565,7 @@
           </w:tcPr>
           <w:p>
             <w:pPr>
-              <w:spacing w:before="40" w:after="40"/>
+              <w:spacing w:before="120" w:after="120"/>
               <w:jc w:val="center"/>
             </w:pPr>
             <w:r>
@@ -1574,7 +1574,7 @@
                 <w:b w:val="0"/>
                 <w:i w:val="0"/>
                 <w:color w:val="222D2A"/>
-                <w:sz w:val="36"/>
+                <w:sz w:val="52"/>
               </w:rPr>
               <w:t>Jill Byrne</w:t>
             </w:r>
@@ -1586,7 +1586,7 @@
           </w:tcPr>
           <w:p>
             <w:pPr>
-              <w:spacing w:before="40" w:after="40"/>
+              <w:spacing w:before="120" w:after="120"/>
               <w:jc w:val="center"/>
             </w:pPr>
             <w:r>
@@ -1595,7 +1595,7 @@
                 <w:b w:val="0"/>
                 <w:i w:val="0"/>
                 <w:color w:val="222D2A"/>
-                <w:sz w:val="36"/>
+                <w:sz w:val="52"/>
               </w:rPr>
               <w:t>Graham Wright</w:t>
             </w:r>
@@ -1609,7 +1609,7 @@
           </w:tcPr>
           <w:p>
             <w:pPr>
-              <w:spacing w:before="40" w:after="40"/>
+              <w:spacing w:before="120" w:after="120"/>
               <w:jc w:val="center"/>
             </w:pPr>
             <w:r>
@@ -1618,7 +1618,7 @@
                 <w:b w:val="0"/>
                 <w:i w:val="0"/>
                 <w:color w:val="222D2A"/>
-                <w:sz w:val="36"/>
+                <w:sz w:val="52"/>
               </w:rPr>
               <w:t>Bob Parkinson</w:t>
             </w:r>
@@ -1751,7 +1751,7 @@
           </w:tcPr>
           <w:p>
             <w:pPr>
-              <w:spacing w:before="40" w:after="40"/>
+              <w:spacing w:before="120" w:after="120"/>
               <w:jc w:val="center"/>
             </w:pPr>
             <w:r>
@@ -1760,7 +1760,7 @@
                 <w:b w:val="0"/>
                 <w:i w:val="0"/>
                 <w:color w:val="222D2A"/>
-                <w:sz w:val="36"/>
+                <w:sz w:val="52"/>
               </w:rPr>
               <w:t>Emma Harte</w:t>
             </w:r>
@@ -1772,7 +1772,7 @@
           </w:tcPr>
           <w:p>
             <w:pPr>
-              <w:spacing w:before="40" w:after="40"/>
+              <w:spacing w:before="120" w:after="120"/>
               <w:jc w:val="center"/>
             </w:pPr>
             <w:r>
@@ -1781,7 +1781,7 @@
                 <w:b w:val="0"/>
                 <w:i w:val="0"/>
                 <w:color w:val="222D2A"/>
-                <w:sz w:val="36"/>
+                <w:sz w:val="52"/>
               </w:rPr>
               <w:t>Ruby</w:t>
             </w:r>
@@ -1795,7 +1795,7 @@
           </w:tcPr>
           <w:p>
             <w:pPr>
-              <w:spacing w:before="40" w:after="40"/>
+              <w:spacing w:before="120" w:after="120"/>
               <w:jc w:val="center"/>
             </w:pPr>
             <w:r>
@@ -1804,7 +1804,7 @@
                 <w:b w:val="0"/>
                 <w:i w:val="0"/>
                 <w:color w:val="222D2A"/>
-                <w:sz w:val="36"/>
+                <w:sz w:val="52"/>
               </w:rPr>
               <w:t>Ben Maguire</w:t>
             </w:r>
@@ -1816,7 +1816,7 @@
           </w:tcPr>
           <w:p>
             <w:pPr>
-              <w:spacing w:before="40" w:after="40"/>
+              <w:spacing w:before="120" w:after="120"/>
               <w:jc w:val="center"/>
             </w:pPr>
             <w:r>
@@ -1825,7 +1825,7 @@
                 <w:b w:val="0"/>
                 <w:i w:val="0"/>
                 <w:color w:val="222D2A"/>
-                <w:sz w:val="36"/>
+                <w:sz w:val="52"/>
               </w:rPr>
               <w:t>Raya Harte</w:t>
             </w:r>
@@ -1839,7 +1839,7 @@
           </w:tcPr>
           <w:p>
             <w:pPr>
-              <w:spacing w:before="40" w:after="40"/>
+              <w:spacing w:before="120" w:after="120"/>
               <w:jc w:val="center"/>
             </w:pPr>
             <w:r>
@@ -1848,7 +1848,7 @@
                 <w:b w:val="0"/>
                 <w:i w:val="0"/>
                 <w:color w:val="222D2A"/>
-                <w:sz w:val="36"/>
+                <w:sz w:val="52"/>
               </w:rPr>
               <w:t>Jerome</w:t>
             </w:r>
@@ -1860,7 +1860,7 @@
           </w:tcPr>
           <w:p>
             <w:pPr>
-              <w:spacing w:before="40" w:after="40"/>
+              <w:spacing w:before="120" w:after="120"/>
               <w:jc w:val="center"/>
             </w:pPr>
             <w:r>
@@ -1869,7 +1869,7 @@
                 <w:b w:val="0"/>
                 <w:i w:val="0"/>
                 <w:color w:val="222D2A"/>
-                <w:sz w:val="36"/>
+                <w:sz w:val="52"/>
               </w:rPr>
               <w:t>Archie Burt</w:t>
             </w:r>
@@ -1996,7 +1996,7 @@
           </w:tcPr>
           <w:p>
             <w:pPr>
-              <w:spacing w:before="40" w:after="40"/>
+              <w:spacing w:before="120" w:after="120"/>
               <w:jc w:val="center"/>
             </w:pPr>
             <w:r>
@@ -2005,7 +2005,7 @@
                 <w:b w:val="0"/>
                 <w:i w:val="0"/>
                 <w:color w:val="222D2A"/>
-                <w:sz w:val="36"/>
+                <w:sz w:val="52"/>
               </w:rPr>
               <w:t>Kathleen Humphries</w:t>
             </w:r>
@@ -2017,7 +2017,7 @@
           </w:tcPr>
           <w:p>
             <w:pPr>
-              <w:spacing w:before="40" w:after="40"/>
+              <w:spacing w:before="120" w:after="120"/>
               <w:jc w:val="center"/>
             </w:pPr>
             <w:r>
@@ -2026,7 +2026,7 @@
                 <w:b w:val="0"/>
                 <w:i w:val="0"/>
                 <w:color w:val="222D2A"/>
-                <w:sz w:val="36"/>
+                <w:sz w:val="52"/>
               </w:rPr>
               <w:t>Tim Bennett</w:t>
             </w:r>
@@ -2040,7 +2040,7 @@
           </w:tcPr>
           <w:p>
             <w:pPr>
-              <w:spacing w:before="40" w:after="40"/>
+              <w:spacing w:before="120" w:after="120"/>
               <w:jc w:val="center"/>
             </w:pPr>
             <w:r>
@@ -2049,7 +2049,7 @@
                 <w:b w:val="0"/>
                 <w:i w:val="0"/>
                 <w:color w:val="222D2A"/>
-                <w:sz w:val="36"/>
+                <w:sz w:val="52"/>
               </w:rPr>
               <w:t>Kenny Earthling</w:t>
             </w:r>
@@ -2061,7 +2061,7 @@
           </w:tcPr>
           <w:p>
             <w:pPr>
-              <w:spacing w:before="40" w:after="40"/>
+              <w:spacing w:before="120" w:after="120"/>
               <w:jc w:val="center"/>
             </w:pPr>
             <w:r>
@@ -2070,7 +2070,7 @@
                 <w:b w:val="0"/>
                 <w:i w:val="0"/>
                 <w:color w:val="222D2A"/>
-                <w:sz w:val="36"/>
+                <w:sz w:val="52"/>
               </w:rPr>
               <w:t>Tina Burke</w:t>
             </w:r>
@@ -2084,7 +2084,7 @@
           </w:tcPr>
           <w:p>
             <w:pPr>
-              <w:spacing w:before="40" w:after="40"/>
+              <w:spacing w:before="120" w:after="120"/>
               <w:jc w:val="center"/>
             </w:pPr>
             <w:r>
@@ -2093,7 +2093,7 @@
                 <w:b w:val="0"/>
                 <w:i w:val="0"/>
                 <w:color w:val="222D2A"/>
-                <w:sz w:val="36"/>
+                <w:sz w:val="52"/>
               </w:rPr>
               <w:t>Trevor Earthling</w:t>
             </w:r>
@@ -2105,7 +2105,7 @@
           </w:tcPr>
           <w:p>
             <w:pPr>
-              <w:spacing w:before="40" w:after="40"/>
+              <w:spacing w:before="120" w:after="120"/>
               <w:jc w:val="center"/>
             </w:pPr>
             <w:r>
@@ -2114,7 +2114,7 @@
                 <w:b w:val="0"/>
                 <w:i w:val="0"/>
                 <w:color w:val="222D2A"/>
-                <w:sz w:val="36"/>
+                <w:sz w:val="52"/>
               </w:rPr>
               <w:t>Marina Ward</w:t>
             </w:r>
@@ -2128,7 +2128,7 @@
           </w:tcPr>
           <w:p>
             <w:pPr>
-              <w:spacing w:before="40" w:after="40"/>
+              <w:spacing w:before="120" w:after="120"/>
               <w:jc w:val="center"/>
             </w:pPr>
             <w:r>
@@ -2137,7 +2137,7 @@
                 <w:b w:val="0"/>
                 <w:i w:val="0"/>
                 <w:color w:val="222D2A"/>
-                <w:sz w:val="36"/>
+                <w:sz w:val="52"/>
               </w:rPr>
               <w:t>Gill Bennett</w:t>
             </w:r>
@@ -2149,7 +2149,7 @@
           </w:tcPr>
           <w:p>
             <w:pPr>
-              <w:spacing w:before="40" w:after="40"/>
+              <w:spacing w:before="120" w:after="120"/>
               <w:jc w:val="center"/>
             </w:pPr>
             <w:r>
@@ -2158,7 +2158,7 @@
                 <w:b w:val="0"/>
                 <w:i w:val="0"/>
                 <w:color w:val="222D2A"/>
-                <w:sz w:val="36"/>
+                <w:sz w:val="52"/>
               </w:rPr>
               <w:t>Pauline McCrann</w:t>
             </w:r>
@@ -2285,7 +2285,7 @@
           </w:tcPr>
           <w:p>
             <w:pPr>
-              <w:spacing w:before="40" w:after="40"/>
+              <w:spacing w:before="120" w:after="120"/>
               <w:jc w:val="center"/>
             </w:pPr>
             <w:r>
@@ -2294,7 +2294,7 @@
                 <w:b w:val="0"/>
                 <w:i w:val="0"/>
                 <w:color w:val="222D2A"/>
-                <w:sz w:val="36"/>
+                <w:sz w:val="52"/>
               </w:rPr>
               <w:t>Kristina Rowe</w:t>
             </w:r>
@@ -2306,7 +2306,7 @@
           </w:tcPr>
           <w:p>
             <w:pPr>
-              <w:spacing w:before="40" w:after="40"/>
+              <w:spacing w:before="120" w:after="120"/>
               <w:jc w:val="center"/>
             </w:pPr>
             <w:r>
@@ -2315,7 +2315,7 @@
                 <w:b w:val="0"/>
                 <w:i w:val="0"/>
                 <w:color w:val="222D2A"/>
-                <w:sz w:val="36"/>
+                <w:sz w:val="52"/>
               </w:rPr>
               <w:t>Charlotte</w:t>
             </w:r>
@@ -2329,7 +2329,7 @@
           </w:tcPr>
           <w:p>
             <w:pPr>
-              <w:spacing w:before="40" w:after="40"/>
+              <w:spacing w:before="120" w:after="120"/>
               <w:jc w:val="center"/>
             </w:pPr>
             <w:r>
@@ -2338,7 +2338,7 @@
                 <w:b w:val="0"/>
                 <w:i w:val="0"/>
                 <w:color w:val="222D2A"/>
-                <w:sz w:val="36"/>
+                <w:sz w:val="52"/>
               </w:rPr>
               <w:t>Daniel English</w:t>
             </w:r>
@@ -2350,7 +2350,7 @@
           </w:tcPr>
           <w:p>
             <w:pPr>
-              <w:spacing w:before="40" w:after="40"/>
+              <w:spacing w:before="120" w:after="120"/>
               <w:jc w:val="center"/>
             </w:pPr>
             <w:r>
@@ -2359,7 +2359,7 @@
                 <w:b w:val="0"/>
                 <w:i w:val="0"/>
                 <w:color w:val="222D2A"/>
-                <w:sz w:val="36"/>
+                <w:sz w:val="52"/>
               </w:rPr>
               <w:t>Claire Gould</w:t>
             </w:r>
@@ -2373,7 +2373,7 @@
           </w:tcPr>
           <w:p>
             <w:pPr>
-              <w:spacing w:before="40" w:after="40"/>
+              <w:spacing w:before="120" w:after="120"/>
               <w:jc w:val="center"/>
             </w:pPr>
             <w:r>
@@ -2382,7 +2382,7 @@
                 <w:b w:val="0"/>
                 <w:i w:val="0"/>
                 <w:color w:val="222D2A"/>
-                <w:sz w:val="36"/>
+                <w:sz w:val="52"/>
               </w:rPr>
               <w:t>Jan Nicholson</w:t>
             </w:r>
@@ -2394,7 +2394,7 @@
           </w:tcPr>
           <w:p>
             <w:pPr>
-              <w:spacing w:before="40" w:after="40"/>
+              <w:spacing w:before="120" w:after="120"/>
               <w:jc w:val="center"/>
             </w:pPr>
             <w:r>
@@ -2403,7 +2403,7 @@
                 <w:b w:val="0"/>
                 <w:i w:val="0"/>
                 <w:color w:val="222D2A"/>
-                <w:sz w:val="36"/>
+                <w:sz w:val="52"/>
               </w:rPr>
               <w:t>Hannah Girvan</w:t>
             </w:r>
@@ -2417,7 +2417,7 @@
           </w:tcPr>
           <w:p>
             <w:pPr>
-              <w:spacing w:before="40" w:after="40"/>
+              <w:spacing w:before="120" w:after="120"/>
               <w:jc w:val="center"/>
             </w:pPr>
             <w:r>
@@ -2426,7 +2426,7 @@
                 <w:b w:val="0"/>
                 <w:i w:val="0"/>
                 <w:color w:val="222D2A"/>
-                <w:sz w:val="36"/>
+                <w:sz w:val="52"/>
               </w:rPr>
               <w:t>Olivia</w:t>
             </w:r>

</xml_diff>